<commit_message>
feat(kol-ops-bridge): enrich contract render and Gmail attachment inference
Add contract_product/product_variants field enrichment on render, infer contract
docx attachments on persist and approve (including idempotent replay recreate),
and document coordinator field sourcing for operators.

Co-authored-by: Cursor <cursoragent@cursor.com>
</commit_message>
<xml_diff>
--- a/plugins/kol-ops-bridge/templates/povison_agreement.docx
+++ b/plugins/kol-ops-bridge/templates/povison_agreement.docx
@@ -42,58 +42,7 @@
     </w:p>
     <w:p>
       <w:r>
-        <w:t>This Agreement was made on</w:t>
-      </w:r>
-      <w:r>
-        <w:rPr>
-          <w:color w:val="EE0000"/>
-        </w:rPr>
-        <w:t xml:space="preserve"> </w:t>
-      </w:r>
-      <w:r>
-        <w:rPr>
-          <w:color w:val="EE0000"/>
-        </w:rPr>
-        <w:t>${DATE}</w:t>
-      </w:r>
-      <w:r>
-        <w:rPr>
-          <w:color w:val="EE0000"/>
-        </w:rPr>
-        <w:t xml:space="preserve"> </w:t>
-      </w:r>
-      <w:r>
-        <w:t>between</w:t>
-      </w:r>
-      <w:r>
-        <w:rPr>
-          <w:rFonts w:hint="eastAsia"/>
-        </w:rPr>
-        <w:t xml:space="preserve"> </w:t>
-      </w:r>
-      <w:r>
-        <w:rPr>
-          <w:color w:val="EE0000"/>
-        </w:rPr>
-        <w:t>${INFLUENCER_FULL NAME}</w:t>
-      </w:r>
-      <w:r>
-        <w:rPr>
-          <w:color w:val="EE0000"/>
-        </w:rPr>
-        <w:t xml:space="preserve"> </w:t>
-      </w:r>
-      <w:r>
-        <w:t xml:space="preserve">(Influencer) and </w:t>
-      </w:r>
-      <w:r>
-        <w:rPr>
-          <w:rFonts w:hint="eastAsia"/>
-        </w:rPr>
-        <w:t>POVISON</w:t>
-      </w:r>
-      <w:r>
-        <w:t xml:space="preserve"> (Advertiser).</w:t>
+        <w:t>This Agreement was made on ${DATE_LONG} between ${INFLUENCER_FULL NAME} (Influencer) and POVISON (Advertiser).</w:t>
       </w:r>
     </w:p>
     <w:p>
@@ -361,14 +310,7 @@
     </w:p>
     <w:p>
       <w:r>
-        <w:rPr>
-          <w:b/>
-          <w:bCs/>
-        </w:rPr>
-        <w:t xml:space="preserve">Contact Name: </w:t>
-      </w:r>
-      <w:r>
-        <w:t>Johnny Miller</w:t>
+        <w:t>Contact Name: Candice Wilson</w:t>
       </w:r>
     </w:p>
     <w:p>

</xml_diff>